<commit_message>
Improve manuscript layout after visual QA
</commit_message>
<xml_diff>
--- a/manuscripts/global_earthquake_activity_analysis_manuscript.docx
+++ b/manuscripts/global_earthquake_activity_analysis_manuscript.docx
@@ -455,6 +455,11 @@
     <w:p>
       <w:r>
         <w:t>Four model families were compared: Logistic Regression, Random Forest, Extra Trees, and Hist Gradient Boosting. The best baseline model was tuned using randomized search with stratified cross-validation.</w:t>
+      </w:r>
+    </w:p>
+    <w:p>
+      <w:r>
+        <w:br w:type="page"/>
       </w:r>
     </w:p>
     <w:p>

</xml_diff>

<commit_message>
Update earthquake publication manuscript
</commit_message>
<xml_diff>
--- a/manuscripts/global_earthquake_activity_analysis_manuscript.docx
+++ b/manuscripts/global_earthquake_activity_analysis_manuscript.docx
@@ -54,7 +54,7 @@
     </w:p>
     <w:p>
       <w:r>
-        <w:t>Background: Public earthquake feeds provide near-real-time global event records that are well suited for reproducible data analysis, geospatial visualization, and supervised learning. Objective: This study explored recent global earthquake activity and evaluated whether reported event properties could classify stronger events, defined as magnitude 4.5 or above. Methods: I downloaded the USGS all-earthquakes monthly GeoJSON feed and converted it to a structured CSV snapshot. After cleaning, 10,464 earthquake records were used for modelling. Feature engineering included temporal variables, location features, depth transformations, hemisphere/quadrant labels, and compact event metadata. Raw magnitude and USGS significance were excluded from modelling to avoid target leakage. Results: Logistic Regression achieved the highest ROC-AUC (0.986), with accuracy 0.952, precision 0.550, recall 0.994, and F1-score 0.708. Conclusion: A simple linear classifier with careful preprocessing performed strongly for identifying already reported stronger earthquake events, but the workflow should be interpreted as event classification, not earthquake forecasting.</w:t>
+        <w:t>Background: Public earthquake feeds provide near-real-time global event records that are well suited for reproducible data analysis, geospatial visualization, and supervised learning. Objective: This study explored recent global earthquake activity and evaluated whether reported event properties could classify stronger events, defined as magnitude 4.5 or above. Methods: I downloaded the USGS all-earthquakes monthly GeoJSON feed and converted it to a structured CSV snapshot. After cleaning, 10,464 earthquake records were used for modelling. Feature engineering included temporal variables, location features, depth transformations, hemisphere/quadrant labels, and compact event metadata. Raw magnitude and USGS significance were excluded from modelling to avoid target leakage. Results: Logistic Regression achieved the highest ROC-AUC (0.986), with accuracy 0.952, precision 0.550, recall 0.994, and F1-score 0.708. Conclusion: A simple linear classifier with careful preprocessing performed strongly for identifying already reported stronger earthquake events. The practical value of the workflow is its leakage-control design: by excluding raw magnitude and derived significance, the study demonstrates how honest feature design can reveal when an interpretable model is sufficient.</w:t>
       </w:r>
     </w:p>
     <w:p>
@@ -84,6 +84,11 @@
     <w:p>
       <w:r>
         <w:t>The central modelling question is whether event characteristics available after reporting can classify stronger events. This is intentionally different from forecasting future earthquakes. The model classifies reported events from their recorded attributes.</w:t>
+      </w:r>
+    </w:p>
+    <w:p>
+      <w:r>
+        <w:t>The practical aim is to show data science professionals how to build a credible modelling workflow around public event data without allowing the answer to leak into the features. This is especially important in geospatial and scientific datasets, where derived fields can quietly encode the target and make a model appear stronger than it really is.</w:t>
       </w:r>
     </w:p>
     <w:p>
@@ -1484,6 +1489,16 @@
       </w:r>
     </w:p>
     <w:p>
+      <w:r>
+        <w:t>The main professional lesson is that leakage control is not a minor preprocessing detail; it defines whether the modelling exercise is meaningful. By removing magnitude and a magnitude-derived significance score, the workflow forces the model to learn from secondary event characteristics rather than from the target definition itself. This creates a more honest benchmark and gives practitioners a reusable checklist for similar projects: identify target-derived fields, exclude or isolate them before modelling, and explain the trade-off between realism and performance.</w:t>
+      </w:r>
+    </w:p>
+    <w:p>
+      <w:r>
+        <w:t>Logistic Regression outperforming more complex models is also practically important. It suggests that, after scaling and one-hot encoding, the engineered event features were sufficiently separable for a linear decision boundary. For data science teams, this result is a reminder to keep simple, interpretable baselines in the comparison set; when they perform as well as or better than ensembles, they can reduce deployment complexity, improve explainability, and make model review easier.</w:t>
+      </w:r>
+    </w:p>
+    <w:p>
       <w:pPr>
         <w:pStyle w:val="Heading1"/>
       </w:pPr>

</xml_diff>